<commit_message>
Sortings and check for directory added in lab1 fopa
</commit_message>
<xml_diff>
--- a/fopa/lab1/report.docx
+++ b/fopa/lab1/report.docx
@@ -312,7 +312,7 @@
           <w:r>
             <w:fldChar w:fldCharType="separate"/>
           </w:r>
-          <w:hyperlink w:anchor="_Toc210432320" w:history="1">
+          <w:hyperlink w:anchor="_Toc210477875" w:history="1">
             <w:r>
               <w:rPr>
                 <w:rStyle w:val="Hyperlink"/>
@@ -341,7 +341,7 @@
                 <w:noProof/>
                 <w:webHidden/>
               </w:rPr>
-              <w:instrText xml:space="preserve"> PAGEREF _Toc210432320 \h </w:instrText>
+              <w:instrText xml:space="preserve"> PAGEREF _Toc210477875 \h </w:instrText>
             </w:r>
             <w:r>
               <w:rPr>
@@ -385,7 +385,7 @@
               <w:lang w:val="en-RU" w:eastAsia="en-GB"/>
             </w:rPr>
           </w:pPr>
-          <w:hyperlink w:anchor="_Toc210432321" w:history="1">
+          <w:hyperlink w:anchor="_Toc210477876" w:history="1">
             <w:r>
               <w:rPr>
                 <w:rStyle w:val="Hyperlink"/>
@@ -414,7 +414,7 @@
                 <w:noProof/>
                 <w:webHidden/>
               </w:rPr>
-              <w:instrText xml:space="preserve"> PAGEREF _Toc210432321 \h </w:instrText>
+              <w:instrText xml:space="preserve"> PAGEREF _Toc210477876 \h </w:instrText>
             </w:r>
             <w:r>
               <w:rPr>
@@ -458,7 +458,7 @@
               <w:lang w:val="en-RU" w:eastAsia="en-GB"/>
             </w:rPr>
           </w:pPr>
-          <w:hyperlink w:anchor="_Toc210432322" w:history="1">
+          <w:hyperlink w:anchor="_Toc210477877" w:history="1">
             <w:r>
               <w:rPr>
                 <w:rStyle w:val="Hyperlink"/>
@@ -485,7 +485,7 @@
                 <w:noProof/>
                 <w:webHidden/>
               </w:rPr>
-              <w:instrText xml:space="preserve"> PAGEREF _Toc210432322 \h </w:instrText>
+              <w:instrText xml:space="preserve"> PAGEREF _Toc210477877 \h </w:instrText>
             </w:r>
             <w:r>
               <w:rPr>
@@ -529,7 +529,7 @@
               <w:lang w:val="en-RU" w:eastAsia="en-GB"/>
             </w:rPr>
           </w:pPr>
-          <w:hyperlink w:anchor="_Toc210432323" w:history="1">
+          <w:hyperlink w:anchor="_Toc210477878" w:history="1">
             <w:r>
               <w:rPr>
                 <w:rStyle w:val="Hyperlink"/>
@@ -564,7 +564,7 @@
                 <w:noProof/>
                 <w:webHidden/>
               </w:rPr>
-              <w:instrText xml:space="preserve"> PAGEREF _Toc210432323 \h </w:instrText>
+              <w:instrText xml:space="preserve"> PAGEREF _Toc210477878 \h </w:instrText>
             </w:r>
             <w:r>
               <w:rPr>
@@ -608,7 +608,7 @@
               <w:lang w:val="en-RU" w:eastAsia="en-GB"/>
             </w:rPr>
           </w:pPr>
-          <w:hyperlink w:anchor="_Toc210432324" w:history="1">
+          <w:hyperlink w:anchor="_Toc210477879" w:history="1">
             <w:r>
               <w:rPr>
                 <w:rStyle w:val="Hyperlink"/>
@@ -643,7 +643,7 @@
                 <w:noProof/>
                 <w:webHidden/>
               </w:rPr>
-              <w:instrText xml:space="preserve"> PAGEREF _Toc210432324 \h </w:instrText>
+              <w:instrText xml:space="preserve"> PAGEREF _Toc210477879 \h </w:instrText>
             </w:r>
             <w:r>
               <w:rPr>
@@ -687,13 +687,27 @@
               <w:lang w:val="en-RU" w:eastAsia="en-GB"/>
             </w:rPr>
           </w:pPr>
-          <w:hyperlink w:anchor="_Toc210432325" w:history="1">
+          <w:hyperlink w:anchor="_Toc210477880" w:history="1">
             <w:r>
               <w:rPr>
                 <w:rStyle w:val="Hyperlink"/>
                 <w:noProof/>
               </w:rPr>
-              <w:t>Пункт</w:t>
+              <w:t>Пун</w:t>
+            </w:r>
+            <w:r>
+              <w:rPr>
+                <w:rStyle w:val="Hyperlink"/>
+                <w:noProof/>
+              </w:rPr>
+              <w:t>к</w:t>
+            </w:r>
+            <w:r>
+              <w:rPr>
+                <w:rStyle w:val="Hyperlink"/>
+                <w:noProof/>
+              </w:rPr>
+              <w:t>т</w:t>
             </w:r>
             <w:r>
               <w:rPr>
@@ -722,7 +736,7 @@
                 <w:noProof/>
                 <w:webHidden/>
               </w:rPr>
-              <w:instrText xml:space="preserve"> PAGEREF _Toc210432325 \h </w:instrText>
+              <w:instrText xml:space="preserve"> PAGEREF _Toc210477880 \h </w:instrText>
             </w:r>
             <w:r>
               <w:rPr>
@@ -766,7 +780,7 @@
               <w:lang w:val="en-RU" w:eastAsia="en-GB"/>
             </w:rPr>
           </w:pPr>
-          <w:hyperlink w:anchor="_Toc210432326" w:history="1">
+          <w:hyperlink w:anchor="_Toc210477881" w:history="1">
             <w:r>
               <w:rPr>
                 <w:rStyle w:val="Hyperlink"/>
@@ -801,7 +815,7 @@
                 <w:noProof/>
                 <w:webHidden/>
               </w:rPr>
-              <w:instrText xml:space="preserve"> PAGEREF _Toc210432326 \h </w:instrText>
+              <w:instrText xml:space="preserve"> PAGEREF _Toc210477881 \h </w:instrText>
             </w:r>
             <w:r>
               <w:rPr>
@@ -845,7 +859,7 @@
               <w:lang w:val="en-RU" w:eastAsia="en-GB"/>
             </w:rPr>
           </w:pPr>
-          <w:hyperlink w:anchor="_Toc210432327" w:history="1">
+          <w:hyperlink w:anchor="_Toc210477882" w:history="1">
             <w:r>
               <w:rPr>
                 <w:rStyle w:val="Hyperlink"/>
@@ -887,7 +901,7 @@
                 <w:noProof/>
                 <w:webHidden/>
               </w:rPr>
-              <w:instrText xml:space="preserve"> PAGEREF _Toc210432327 \h </w:instrText>
+              <w:instrText xml:space="preserve"> PAGEREF _Toc210477882 \h </w:instrText>
             </w:r>
             <w:r>
               <w:rPr>
@@ -931,7 +945,7 @@
               <w:lang w:val="en-RU" w:eastAsia="en-GB"/>
             </w:rPr>
           </w:pPr>
-          <w:hyperlink w:anchor="_Toc210432328" w:history="1">
+          <w:hyperlink w:anchor="_Toc210477883" w:history="1">
             <w:r>
               <w:rPr>
                 <w:rStyle w:val="Hyperlink"/>
@@ -960,7 +974,7 @@
                 <w:noProof/>
                 <w:webHidden/>
               </w:rPr>
-              <w:instrText xml:space="preserve"> PAGEREF _Toc210432328 \h </w:instrText>
+              <w:instrText xml:space="preserve"> PAGEREF _Toc210477883 \h </w:instrText>
             </w:r>
             <w:r>
               <w:rPr>
@@ -1004,7 +1018,7 @@
               <w:lang w:val="en-RU" w:eastAsia="en-GB"/>
             </w:rPr>
           </w:pPr>
-          <w:hyperlink w:anchor="_Toc210432329" w:history="1">
+          <w:hyperlink w:anchor="_Toc210477884" w:history="1">
             <w:r>
               <w:rPr>
                 <w:rStyle w:val="Hyperlink"/>
@@ -1033,7 +1047,7 @@
                 <w:noProof/>
                 <w:webHidden/>
               </w:rPr>
-              <w:instrText xml:space="preserve"> PAGEREF _Toc210432329 \h </w:instrText>
+              <w:instrText xml:space="preserve"> PAGEREF _Toc210477884 \h </w:instrText>
             </w:r>
             <w:r>
               <w:rPr>
@@ -1105,7 +1119,7 @@
           <w:bCs/>
         </w:rPr>
       </w:pPr>
-      <w:bookmarkStart w:id="0" w:name="_Toc210432320"/>
+      <w:bookmarkStart w:id="0" w:name="_Toc210477875"/>
       <w:r>
         <w:rPr>
           <w:b/>
@@ -1486,7 +1500,7 @@
           <w:bCs/>
         </w:rPr>
       </w:pPr>
-      <w:bookmarkStart w:id="1" w:name="_Toc210432321"/>
+      <w:bookmarkStart w:id="1" w:name="_Toc210477876"/>
       <w:r>
         <w:rPr>
           <w:b/>
@@ -1509,7 +1523,7 @@
         <w:pStyle w:val="Heading2"/>
         <w:jc w:val="center"/>
       </w:pPr>
-      <w:bookmarkStart w:id="2" w:name="_Toc210432322"/>
+      <w:bookmarkStart w:id="2" w:name="_Toc210477877"/>
       <w:r>
         <w:t>Пункт 1</w:t>
       </w:r>
@@ -2643,7 +2657,7 @@
           <w:lang w:val="en-US"/>
         </w:rPr>
       </w:pPr>
-      <w:bookmarkStart w:id="3" w:name="_Toc210432323"/>
+      <w:bookmarkStart w:id="3" w:name="_Toc210477878"/>
       <w:r>
         <w:lastRenderedPageBreak/>
         <w:t>Пункт</w:t>
@@ -3589,7 +3603,7 @@
           <w:lang w:val="en-US"/>
         </w:rPr>
       </w:pPr>
-      <w:bookmarkStart w:id="4" w:name="_Toc210432324"/>
+      <w:bookmarkStart w:id="4" w:name="_Toc210477879"/>
       <w:r>
         <w:lastRenderedPageBreak/>
         <w:t>Пункт</w:t>
@@ -8032,7 +8046,7 @@
           <w:lang w:val="en-US"/>
         </w:rPr>
       </w:pPr>
-      <w:bookmarkStart w:id="5" w:name="_Toc210432325"/>
+      <w:bookmarkStart w:id="5" w:name="_Toc210477880"/>
       <w:r>
         <w:lastRenderedPageBreak/>
         <w:t>Пункт</w:t>
@@ -8171,7 +8185,7 @@
           <w:szCs w:val="28"/>
           <w:lang w:val="en-GB"/>
         </w:rPr>
-        <w:t xml:space="preserve"> -l lab0/*[8] 2&gt;&amp;1</w:t>
+        <w:t xml:space="preserve"> -l lab0/*[8] 2&gt;&amp;1 | sort -k1nr</w:t>
       </w:r>
     </w:p>
     <w:p>
@@ -8946,7 +8960,27 @@
           <w:szCs w:val="28"/>
           <w:lang w:val="en-GB"/>
         </w:rPr>
-        <w:t xml:space="preserve"> lab0 2&gt;/dev/null | grep "ka" | grep -v ":$" | head -n 2</w:t>
+        <w:t xml:space="preserve"> lab0 2&gt;/dev/null | grep "ka" | grep -v ":$" | sort -k5 |</w:t>
+      </w:r>
+      <w:r>
+        <w:rPr>
+          <w:rFonts w:cs="Times New Roman"/>
+          <w:color w:val="000000" w:themeColor="text1"/>
+          <w:kern w:val="0"/>
+          <w:szCs w:val="28"/>
+          <w:lang w:val="en-GB"/>
+        </w:rPr>
+        <w:t xml:space="preserve"> </w:t>
+      </w:r>
+      <w:r>
+        <w:rPr>
+          <w:rFonts w:cs="Times New Roman"/>
+          <w:color w:val="000000" w:themeColor="text1"/>
+          <w:kern w:val="0"/>
+          <w:szCs w:val="28"/>
+          <w:lang w:val="en-GB"/>
+        </w:rPr>
+        <w:t>head -n 2</w:t>
       </w:r>
     </w:p>
     <w:p>
@@ -9168,29 +9202,7 @@
     </w:p>
     <w:p>
       <w:pPr>
-        <w:tabs>
-          <w:tab w:val="left" w:pos="560"/>
-          <w:tab w:val="left" w:pos="1120"/>
-          <w:tab w:val="left" w:pos="1680"/>
-          <w:tab w:val="left" w:pos="2240"/>
-          <w:tab w:val="left" w:pos="2800"/>
-          <w:tab w:val="left" w:pos="3360"/>
-          <w:tab w:val="left" w:pos="3920"/>
-          <w:tab w:val="left" w:pos="4480"/>
-          <w:tab w:val="left" w:pos="5040"/>
-          <w:tab w:val="left" w:pos="5600"/>
-          <w:tab w:val="left" w:pos="6160"/>
-          <w:tab w:val="left" w:pos="6720"/>
-        </w:tabs>
-        <w:autoSpaceDE w:val="0"/>
-        <w:autoSpaceDN w:val="0"/>
-        <w:adjustRightInd w:val="0"/>
-        <w:spacing w:after="0" w:line="240" w:lineRule="auto"/>
-        <w:rPr>
-          <w:rFonts w:cs="Times New Roman"/>
-          <w:color w:val="000000" w:themeColor="text1"/>
-          <w:kern w:val="0"/>
-          <w:szCs w:val="28"/>
+        <w:rPr>
           <w:lang w:val="en-GB"/>
         </w:rPr>
       </w:pPr>
@@ -9246,15 +9258,28 @@
           <w:szCs w:val="28"/>
           <w:lang w:val="en-GB"/>
         </w:rPr>
-        <w:t>/log.txt | grep -v ":$"| grep "a$" | sort -k8r | tail -n 4</w:t>
-      </w:r>
-    </w:p>
-    <w:p>
-      <w:pPr>
-        <w:rPr>
-          <w:lang w:val="en-GB"/>
-        </w:rPr>
-      </w:pPr>
+        <w:t>/log.txt | grep -v / | grep -v ":$"| grep "a$" | sort -k8r | tail -n</w:t>
+      </w:r>
+      <w:r>
+        <w:rPr>
+          <w:rFonts w:cs="Times New Roman"/>
+          <w:color w:val="000000" w:themeColor="text1"/>
+          <w:kern w:val="0"/>
+          <w:szCs w:val="28"/>
+          <w:lang w:val="en-GB"/>
+        </w:rPr>
+        <w:t xml:space="preserve"> </w:t>
+      </w:r>
+      <w:r>
+        <w:rPr>
+          <w:rFonts w:cs="Times New Roman"/>
+          <w:color w:val="000000" w:themeColor="text1"/>
+          <w:kern w:val="0"/>
+          <w:szCs w:val="28"/>
+          <w:lang w:val="en-GB"/>
+        </w:rPr>
+        <w:t>4</w:t>
+      </w:r>
     </w:p>
     <w:p>
       <w:r>
@@ -9432,7 +9457,7 @@
           <w:szCs w:val="28"/>
           <w:lang w:val="en-GB"/>
         </w:rPr>
-        <w:t xml:space="preserve">       2 lab0/mothim8</w:t>
+        <w:t xml:space="preserve">      10 total</w:t>
       </w:r>
     </w:p>
     <w:p>
@@ -9463,27 +9488,15 @@
           <w:lang w:val="en-GB"/>
         </w:rPr>
       </w:pPr>
-      <w:proofErr w:type="spellStart"/>
-      <w:r>
-        <w:rPr>
-          <w:rFonts w:cs="Times New Roman"/>
-          <w:color w:val="000000"/>
-          <w:kern w:val="0"/>
-          <w:szCs w:val="28"/>
-          <w:lang w:val="en-GB"/>
-        </w:rPr>
-        <w:t>wc</w:t>
-      </w:r>
-      <w:proofErr w:type="spellEnd"/>
-      <w:r>
-        <w:rPr>
-          <w:rFonts w:cs="Times New Roman"/>
-          <w:color w:val="000000"/>
-          <w:kern w:val="0"/>
-          <w:szCs w:val="28"/>
-          <w:lang w:val="en-GB"/>
-        </w:rPr>
-        <w:t>: lab0/piloswine8: open: Permission denied</w:t>
+      <w:r>
+        <w:rPr>
+          <w:rFonts w:cs="Times New Roman"/>
+          <w:color w:val="000000"/>
+          <w:kern w:val="0"/>
+          <w:szCs w:val="28"/>
+          <w:lang w:val="en-GB"/>
+        </w:rPr>
+        <w:t xml:space="preserve">       8 lab0/snivy9_48</w:t>
       </w:r>
     </w:p>
     <w:p>
@@ -9522,7 +9535,7 @@
           <w:szCs w:val="28"/>
           <w:lang w:val="en-GB"/>
         </w:rPr>
-        <w:t xml:space="preserve">       8 lab0/snivy9_48</w:t>
+        <w:t xml:space="preserve">       2 lab0/mothim8</w:t>
       </w:r>
     </w:p>
     <w:p>
@@ -9553,15 +9566,27 @@
           <w:lang w:val="en-GB"/>
         </w:rPr>
       </w:pPr>
-      <w:r>
-        <w:rPr>
-          <w:rFonts w:cs="Times New Roman"/>
-          <w:color w:val="000000"/>
-          <w:kern w:val="0"/>
-          <w:szCs w:val="28"/>
-          <w:lang w:val="en-GB"/>
-        </w:rPr>
-        <w:t xml:space="preserve">      10 total</w:t>
+      <w:proofErr w:type="spellStart"/>
+      <w:r>
+        <w:rPr>
+          <w:rFonts w:cs="Times New Roman"/>
+          <w:color w:val="000000"/>
+          <w:kern w:val="0"/>
+          <w:szCs w:val="28"/>
+          <w:lang w:val="en-GB"/>
+        </w:rPr>
+        <w:t>wc</w:t>
+      </w:r>
+      <w:proofErr w:type="spellEnd"/>
+      <w:r>
+        <w:rPr>
+          <w:rFonts w:cs="Times New Roman"/>
+          <w:color w:val="000000"/>
+          <w:kern w:val="0"/>
+          <w:szCs w:val="28"/>
+          <w:lang w:val="en-GB"/>
+        </w:rPr>
+        <w:t>: lab0/piloswine8: open: Permission denied</w:t>
       </w:r>
     </w:p>
     <w:p>
@@ -9763,6 +9788,7 @@
           <w:szCs w:val="28"/>
           <w:lang w:val="en-GB"/>
         </w:rPr>
+        <w:lastRenderedPageBreak/>
         <w:t xml:space="preserve">-r--r-----  1 miwm64  staff   29 Oct  3 22:03 </w:t>
       </w:r>
       <w:proofErr w:type="spellStart"/>
@@ -9814,7 +9840,6 @@
           <w:szCs w:val="28"/>
           <w:lang w:val="en-GB"/>
         </w:rPr>
-        <w:lastRenderedPageBreak/>
         <w:t>total 24</w:t>
       </w:r>
     </w:p>
@@ -10098,18 +10123,18 @@
           <w:szCs w:val="28"/>
           <w:lang w:val="en-GB"/>
         </w:rPr>
-        <w:t>drwx-wx-wx</w:t>
-      </w:r>
-      <w:proofErr w:type="spellEnd"/>
-      <w:r>
-        <w:rPr>
-          <w:rFonts w:cs="Times New Roman"/>
-          <w:color w:val="000000"/>
-          <w:kern w:val="0"/>
-          <w:szCs w:val="28"/>
-          <w:lang w:val="en-GB"/>
-        </w:rPr>
-        <w:t xml:space="preserve">  3 miwm64  staff   96 Oct  3 22:03 </w:t>
+        <w:t>drwx</w:t>
+      </w:r>
+      <w:proofErr w:type="spellEnd"/>
+      <w:r>
+        <w:rPr>
+          <w:rFonts w:cs="Times New Roman"/>
+          <w:color w:val="000000"/>
+          <w:kern w:val="0"/>
+          <w:szCs w:val="28"/>
+          <w:lang w:val="en-GB"/>
+        </w:rPr>
+        <w:t xml:space="preserve">--x--x  2 miwm64  staff   64 Oct  4 14:12 </w:t>
       </w:r>
       <w:proofErr w:type="spellStart"/>
       <w:r>
@@ -10161,18 +10186,18 @@
           <w:szCs w:val="28"/>
           <w:lang w:val="en-GB"/>
         </w:rPr>
-        <w:t>drwx</w:t>
-      </w:r>
-      <w:proofErr w:type="spellEnd"/>
-      <w:r>
-        <w:rPr>
-          <w:rFonts w:cs="Times New Roman"/>
-          <w:color w:val="000000"/>
-          <w:kern w:val="0"/>
-          <w:szCs w:val="28"/>
-          <w:lang w:val="en-GB"/>
-        </w:rPr>
-        <w:t xml:space="preserve">--x--x  2 miwm64  staff   64 Oct  3 22:03 </w:t>
+        <w:t>drwx-wx-wx</w:t>
+      </w:r>
+      <w:proofErr w:type="spellEnd"/>
+      <w:r>
+        <w:rPr>
+          <w:rFonts w:cs="Times New Roman"/>
+          <w:color w:val="000000"/>
+          <w:kern w:val="0"/>
+          <w:szCs w:val="28"/>
+          <w:lang w:val="en-GB"/>
+        </w:rPr>
+        <w:t xml:space="preserve">  3 miwm64  staff   96 Oct  4 14:12 </w:t>
       </w:r>
       <w:proofErr w:type="spellStart"/>
       <w:r>
@@ -10469,6 +10494,201 @@
     </w:p>
     <w:p>
       <w:pPr>
+        <w:rPr>
+          <w:rFonts w:cs="Times New Roman"/>
+          <w:color w:val="000000"/>
+          <w:kern w:val="0"/>
+          <w:szCs w:val="28"/>
+          <w:lang w:val="en-GB"/>
+        </w:rPr>
+      </w:pPr>
+      <w:proofErr w:type="spellStart"/>
+      <w:r>
+        <w:rPr>
+          <w:rFonts w:cs="Times New Roman"/>
+          <w:color w:val="000000"/>
+          <w:kern w:val="0"/>
+          <w:szCs w:val="28"/>
+          <w:lang w:val="en-GB"/>
+        </w:rPr>
+        <w:t>drwx</w:t>
+      </w:r>
+      <w:proofErr w:type="spellEnd"/>
+      <w:r>
+        <w:rPr>
+          <w:rFonts w:cs="Times New Roman"/>
+          <w:color w:val="000000"/>
+          <w:kern w:val="0"/>
+          <w:szCs w:val="28"/>
+          <w:lang w:val="en-GB"/>
+        </w:rPr>
+        <w:t xml:space="preserve">--x--x  2 miwm64  staff   64 Oct  4 14:12 </w:t>
+      </w:r>
+      <w:proofErr w:type="spellStart"/>
+      <w:r>
+        <w:rPr>
+          <w:rFonts w:cs="Times New Roman"/>
+          <w:color w:val="000000"/>
+          <w:kern w:val="0"/>
+          <w:szCs w:val="28"/>
+          <w:lang w:val="en-GB"/>
+        </w:rPr>
+        <w:t>kadabra</w:t>
+      </w:r>
+      <w:proofErr w:type="spellEnd"/>
+    </w:p>
+    <w:p>
+      <w:pPr>
+        <w:rPr>
+          <w:rFonts w:cs="Times New Roman"/>
+          <w:color w:val="000000"/>
+          <w:kern w:val="0"/>
+          <w:szCs w:val="28"/>
+          <w:lang w:val="en-GB"/>
+        </w:rPr>
+      </w:pPr>
+      <w:proofErr w:type="spellStart"/>
+      <w:r>
+        <w:rPr>
+          <w:rFonts w:cs="Times New Roman"/>
+          <w:color w:val="000000"/>
+          <w:kern w:val="0"/>
+          <w:szCs w:val="28"/>
+          <w:lang w:val="en-GB"/>
+        </w:rPr>
+        <w:t>drwx-wx-wx</w:t>
+      </w:r>
+      <w:proofErr w:type="spellEnd"/>
+      <w:r>
+        <w:rPr>
+          <w:rFonts w:cs="Times New Roman"/>
+          <w:color w:val="000000"/>
+          <w:kern w:val="0"/>
+          <w:szCs w:val="28"/>
+          <w:lang w:val="en-GB"/>
+        </w:rPr>
+        <w:t xml:space="preserve">  3 miwm64  staff   96 Oct  4 14:12 </w:t>
+      </w:r>
+      <w:proofErr w:type="spellStart"/>
+      <w:r>
+        <w:rPr>
+          <w:rFonts w:cs="Times New Roman"/>
+          <w:color w:val="000000"/>
+          <w:kern w:val="0"/>
+          <w:szCs w:val="28"/>
+          <w:lang w:val="en-GB"/>
+        </w:rPr>
+        <w:t>kadabra</w:t>
+      </w:r>
+      <w:proofErr w:type="spellEnd"/>
+    </w:p>
+    <w:p>
+      <w:pPr>
+        <w:rPr>
+          <w:lang w:val="en-US"/>
+        </w:rPr>
+      </w:pPr>
+    </w:p>
+    <w:p>
+      <w:pPr>
+        <w:rPr>
+          <w:lang w:val="en-US"/>
+        </w:rPr>
+      </w:pPr>
+    </w:p>
+    <w:p>
+      <w:pPr>
+        <w:rPr>
+          <w:lang w:val="en-US"/>
+        </w:rPr>
+      </w:pPr>
+    </w:p>
+    <w:p>
+      <w:pPr>
+        <w:rPr>
+          <w:lang w:val="en-US"/>
+        </w:rPr>
+      </w:pPr>
+    </w:p>
+    <w:p>
+      <w:pPr>
+        <w:rPr>
+          <w:lang w:val="en-US"/>
+        </w:rPr>
+      </w:pPr>
+    </w:p>
+    <w:p>
+      <w:pPr>
+        <w:rPr>
+          <w:lang w:val="en-US"/>
+        </w:rPr>
+      </w:pPr>
+    </w:p>
+    <w:p>
+      <w:pPr>
+        <w:rPr>
+          <w:lang w:val="en-US"/>
+        </w:rPr>
+      </w:pPr>
+    </w:p>
+    <w:p>
+      <w:pPr>
+        <w:rPr>
+          <w:lang w:val="en-US"/>
+        </w:rPr>
+      </w:pPr>
+    </w:p>
+    <w:p>
+      <w:pPr>
+        <w:rPr>
+          <w:lang w:val="en-US"/>
+        </w:rPr>
+      </w:pPr>
+    </w:p>
+    <w:p>
+      <w:pPr>
+        <w:rPr>
+          <w:lang w:val="en-US"/>
+        </w:rPr>
+      </w:pPr>
+    </w:p>
+    <w:p>
+      <w:pPr>
+        <w:rPr>
+          <w:lang w:val="en-US"/>
+        </w:rPr>
+      </w:pPr>
+    </w:p>
+    <w:p>
+      <w:pPr>
+        <w:rPr>
+          <w:lang w:val="en-US"/>
+        </w:rPr>
+      </w:pPr>
+    </w:p>
+    <w:p>
+      <w:pPr>
+        <w:pStyle w:val="Heading2"/>
+        <w:jc w:val="center"/>
+        <w:rPr>
+          <w:lang w:val="en-US"/>
+        </w:rPr>
+      </w:pPr>
+      <w:bookmarkStart w:id="6" w:name="_Toc210477881"/>
+      <w:r>
+        <w:lastRenderedPageBreak/>
+        <w:t>Пункт</w:t>
+      </w:r>
+      <w:r>
+        <w:rPr>
+          <w:lang w:val="en-US"/>
+        </w:rPr>
+        <w:t xml:space="preserve"> 5</w:t>
+      </w:r>
+      <w:bookmarkEnd w:id="6"/>
+    </w:p>
+    <w:p>
+      <w:pPr>
         <w:tabs>
           <w:tab w:val="left" w:pos="560"/>
           <w:tab w:val="left" w:pos="1120"/>
@@ -10489,201 +10709,22 @@
         <w:spacing w:after="0" w:line="240" w:lineRule="auto"/>
         <w:rPr>
           <w:rFonts w:cs="Times New Roman"/>
-          <w:color w:val="000000"/>
-          <w:kern w:val="0"/>
-          <w:szCs w:val="28"/>
-          <w:lang w:val="en-GB"/>
-        </w:rPr>
-      </w:pPr>
-      <w:proofErr w:type="spellStart"/>
-      <w:r>
-        <w:rPr>
-          <w:rFonts w:cs="Times New Roman"/>
-          <w:color w:val="000000"/>
-          <w:kern w:val="0"/>
-          <w:szCs w:val="28"/>
-          <w:lang w:val="en-GB"/>
-        </w:rPr>
-        <w:t>drwx</w:t>
-      </w:r>
-      <w:proofErr w:type="spellEnd"/>
-      <w:r>
-        <w:rPr>
-          <w:rFonts w:cs="Times New Roman"/>
-          <w:color w:val="000000"/>
-          <w:kern w:val="0"/>
-          <w:szCs w:val="28"/>
-          <w:lang w:val="en-GB"/>
-        </w:rPr>
-        <w:t xml:space="preserve">--x--x  2 miwm64  staff   64 Oct  3 22:03 </w:t>
-      </w:r>
-      <w:proofErr w:type="spellStart"/>
-      <w:r>
-        <w:rPr>
-          <w:rFonts w:cs="Times New Roman"/>
-          <w:color w:val="000000"/>
-          <w:kern w:val="0"/>
-          <w:szCs w:val="28"/>
-          <w:lang w:val="en-GB"/>
-        </w:rPr>
-        <w:t>kadabra</w:t>
-      </w:r>
-      <w:proofErr w:type="spellEnd"/>
-    </w:p>
-    <w:p>
-      <w:pPr>
-        <w:rPr>
-          <w:rFonts w:cs="Times New Roman"/>
-          <w:szCs w:val="28"/>
-          <w:lang w:val="en-US"/>
-        </w:rPr>
-      </w:pPr>
-      <w:proofErr w:type="spellStart"/>
-      <w:r>
-        <w:rPr>
-          <w:rFonts w:cs="Times New Roman"/>
-          <w:color w:val="000000"/>
-          <w:kern w:val="0"/>
-          <w:szCs w:val="28"/>
-          <w:lang w:val="en-GB"/>
-        </w:rPr>
-        <w:t>drwx-wx-wx</w:t>
-      </w:r>
-      <w:proofErr w:type="spellEnd"/>
-      <w:r>
-        <w:rPr>
-          <w:rFonts w:cs="Times New Roman"/>
-          <w:color w:val="000000"/>
-          <w:kern w:val="0"/>
-          <w:szCs w:val="28"/>
-          <w:lang w:val="en-GB"/>
-        </w:rPr>
-        <w:t xml:space="preserve">  3 miwm64  staff   96 Oct  3 22:03 </w:t>
-      </w:r>
-      <w:proofErr w:type="spellStart"/>
-      <w:r>
-        <w:rPr>
-          <w:rFonts w:cs="Times New Roman"/>
-          <w:color w:val="000000"/>
-          <w:kern w:val="0"/>
-          <w:szCs w:val="28"/>
-          <w:lang w:val="en-GB"/>
-        </w:rPr>
-        <w:t>kadabra</w:t>
-      </w:r>
-      <w:proofErr w:type="spellEnd"/>
-    </w:p>
-    <w:p>
-      <w:pPr>
-        <w:rPr>
-          <w:lang w:val="en-US"/>
-        </w:rPr>
-      </w:pPr>
-    </w:p>
-    <w:p>
-      <w:pPr>
-        <w:rPr>
-          <w:lang w:val="en-US"/>
-        </w:rPr>
-      </w:pPr>
-    </w:p>
-    <w:p>
-      <w:pPr>
-        <w:rPr>
-          <w:lang w:val="en-US"/>
-        </w:rPr>
-      </w:pPr>
-    </w:p>
-    <w:p>
-      <w:pPr>
-        <w:rPr>
-          <w:lang w:val="en-US"/>
-        </w:rPr>
-      </w:pPr>
-    </w:p>
-    <w:p>
-      <w:pPr>
-        <w:rPr>
-          <w:lang w:val="en-US"/>
-        </w:rPr>
-      </w:pPr>
-    </w:p>
-    <w:p>
-      <w:pPr>
-        <w:rPr>
-          <w:lang w:val="en-US"/>
-        </w:rPr>
-      </w:pPr>
-    </w:p>
-    <w:p>
-      <w:pPr>
-        <w:rPr>
-          <w:lang w:val="en-US"/>
-        </w:rPr>
-      </w:pPr>
-    </w:p>
-    <w:p>
-      <w:pPr>
-        <w:rPr>
-          <w:lang w:val="en-US"/>
-        </w:rPr>
-      </w:pPr>
-    </w:p>
-    <w:p>
-      <w:pPr>
-        <w:rPr>
-          <w:lang w:val="en-US"/>
-        </w:rPr>
-      </w:pPr>
-    </w:p>
-    <w:p>
-      <w:pPr>
-        <w:rPr>
-          <w:lang w:val="en-US"/>
-        </w:rPr>
-      </w:pPr>
-    </w:p>
-    <w:p>
-      <w:pPr>
-        <w:rPr>
-          <w:lang w:val="en-US"/>
-        </w:rPr>
-      </w:pPr>
-    </w:p>
-    <w:p>
-      <w:pPr>
-        <w:rPr>
-          <w:lang w:val="en-US"/>
-        </w:rPr>
-      </w:pPr>
-    </w:p>
-    <w:p>
-      <w:pPr>
-        <w:rPr>
-          <w:lang w:val="en-US"/>
-        </w:rPr>
-      </w:pPr>
-    </w:p>
-    <w:p>
-      <w:pPr>
-        <w:pStyle w:val="Heading2"/>
-        <w:jc w:val="center"/>
-        <w:rPr>
-          <w:lang w:val="en-US"/>
-        </w:rPr>
-      </w:pPr>
-      <w:bookmarkStart w:id="6" w:name="_Toc210432326"/>
-      <w:r>
-        <w:lastRenderedPageBreak/>
-        <w:t>Пункт</w:t>
-      </w:r>
-      <w:r>
-        <w:rPr>
-          <w:lang w:val="en-US"/>
-        </w:rPr>
-        <w:t xml:space="preserve"> 5</w:t>
-      </w:r>
-      <w:bookmarkEnd w:id="6"/>
+          <w:color w:val="000000" w:themeColor="text1"/>
+          <w:kern w:val="0"/>
+          <w:szCs w:val="28"/>
+          <w:lang w:val="en-GB"/>
+        </w:rPr>
+      </w:pPr>
+      <w:r>
+        <w:rPr>
+          <w:rFonts w:cs="Times New Roman"/>
+          <w:color w:val="000000" w:themeColor="text1"/>
+          <w:kern w:val="0"/>
+          <w:szCs w:val="28"/>
+          <w:lang w:val="en-GB"/>
+        </w:rPr>
+        <w:t>rm lab0/snivy9</w:t>
+      </w:r>
     </w:p>
     <w:p>
       <w:pPr>
@@ -10721,8 +10762,20 @@
           <w:szCs w:val="28"/>
           <w:lang w:val="en-GB"/>
         </w:rPr>
-        <w:t>rm lab0/snivy9</w:t>
-      </w:r>
+        <w:t>rm -f lab0/elgyem3/</w:t>
+      </w:r>
+      <w:proofErr w:type="spellStart"/>
+      <w:r>
+        <w:rPr>
+          <w:rFonts w:cs="Times New Roman"/>
+          <w:color w:val="000000" w:themeColor="text1"/>
+          <w:kern w:val="0"/>
+          <w:szCs w:val="28"/>
+          <w:lang w:val="en-GB"/>
+        </w:rPr>
+        <w:t>mismagius</w:t>
+      </w:r>
+      <w:proofErr w:type="spellEnd"/>
     </w:p>
     <w:p>
       <w:pPr>
@@ -10760,20 +10813,30 @@
           <w:szCs w:val="28"/>
           <w:lang w:val="en-GB"/>
         </w:rPr>
-        <w:t>rm -f lab0/elgyem3/</w:t>
-      </w:r>
-      <w:proofErr w:type="spellStart"/>
-      <w:r>
-        <w:rPr>
-          <w:rFonts w:cs="Times New Roman"/>
-          <w:color w:val="000000" w:themeColor="text1"/>
-          <w:kern w:val="0"/>
-          <w:szCs w:val="28"/>
-          <w:lang w:val="en-GB"/>
-        </w:rPr>
-        <w:t>mismagius</w:t>
-      </w:r>
-      <w:proofErr w:type="spellEnd"/>
+        <w:t>rm lab0/elgyem3/</w:t>
+      </w:r>
+      <w:proofErr w:type="spellStart"/>
+      <w:r>
+        <w:rPr>
+          <w:rFonts w:cs="Times New Roman"/>
+          <w:color w:val="000000" w:themeColor="text1"/>
+          <w:kern w:val="0"/>
+          <w:szCs w:val="28"/>
+          <w:lang w:val="en-GB"/>
+        </w:rPr>
+        <w:t>feraligatrmoth</w:t>
+      </w:r>
+      <w:proofErr w:type="spellEnd"/>
+      <w:r>
+        <w:rPr>
+          <w:rFonts w:cs="Times New Roman"/>
+          <w:color w:val="000000" w:themeColor="text1"/>
+          <w:kern w:val="0"/>
+          <w:szCs w:val="28"/>
+          <w:lang w:val="en-GB"/>
+        </w:rPr>
+        <w:t>*</w:t>
+      </w:r>
     </w:p>
     <w:p>
       <w:pPr>
@@ -10803,37 +10866,27 @@
           <w:lang w:val="en-GB"/>
         </w:rPr>
       </w:pPr>
-      <w:r>
-        <w:rPr>
-          <w:rFonts w:cs="Times New Roman"/>
-          <w:color w:val="000000" w:themeColor="text1"/>
-          <w:kern w:val="0"/>
-          <w:szCs w:val="28"/>
-          <w:lang w:val="en-GB"/>
-        </w:rPr>
-        <w:t>rm lab0/elgyem3/</w:t>
-      </w:r>
-      <w:proofErr w:type="spellStart"/>
-      <w:r>
-        <w:rPr>
-          <w:rFonts w:cs="Times New Roman"/>
-          <w:color w:val="000000" w:themeColor="text1"/>
-          <w:kern w:val="0"/>
-          <w:szCs w:val="28"/>
-          <w:lang w:val="en-GB"/>
-        </w:rPr>
-        <w:t>feraligatrmoth</w:t>
-      </w:r>
-      <w:proofErr w:type="spellEnd"/>
-      <w:r>
-        <w:rPr>
-          <w:rFonts w:cs="Times New Roman"/>
-          <w:color w:val="000000" w:themeColor="text1"/>
-          <w:kern w:val="0"/>
-          <w:szCs w:val="28"/>
-          <w:lang w:val="en-GB"/>
-        </w:rPr>
-        <w:t>*</w:t>
+      <w:proofErr w:type="spellStart"/>
+      <w:r>
+        <w:rPr>
+          <w:rFonts w:cs="Times New Roman"/>
+          <w:color w:val="000000" w:themeColor="text1"/>
+          <w:kern w:val="0"/>
+          <w:szCs w:val="28"/>
+          <w:lang w:val="en-GB"/>
+        </w:rPr>
+        <w:t>chmod</w:t>
+      </w:r>
+      <w:proofErr w:type="spellEnd"/>
+      <w:r>
+        <w:rPr>
+          <w:rFonts w:cs="Times New Roman"/>
+          <w:color w:val="000000" w:themeColor="text1"/>
+          <w:kern w:val="0"/>
+          <w:szCs w:val="28"/>
+          <w:lang w:val="en-GB"/>
+        </w:rPr>
+        <w:t xml:space="preserve"> 777 lab0/krabby9</w:t>
       </w:r>
     </w:p>
     <w:p>
@@ -10864,27 +10917,37 @@
           <w:lang w:val="en-GB"/>
         </w:rPr>
       </w:pPr>
-      <w:proofErr w:type="spellStart"/>
-      <w:r>
-        <w:rPr>
-          <w:rFonts w:cs="Times New Roman"/>
-          <w:color w:val="000000" w:themeColor="text1"/>
-          <w:kern w:val="0"/>
-          <w:szCs w:val="28"/>
-          <w:lang w:val="en-GB"/>
-        </w:rPr>
-        <w:t>chmod</w:t>
-      </w:r>
-      <w:proofErr w:type="spellEnd"/>
-      <w:r>
-        <w:rPr>
-          <w:rFonts w:cs="Times New Roman"/>
-          <w:color w:val="000000" w:themeColor="text1"/>
-          <w:kern w:val="0"/>
-          <w:szCs w:val="28"/>
-          <w:lang w:val="en-GB"/>
-        </w:rPr>
-        <w:t xml:space="preserve"> 777 lab0/krabby9</w:t>
+      <w:r>
+        <w:rPr>
+          <w:rFonts w:cs="Times New Roman"/>
+          <w:color w:val="000000" w:themeColor="text1"/>
+          <w:kern w:val="0"/>
+          <w:szCs w:val="28"/>
+          <w:lang w:val="en-GB"/>
+        </w:rPr>
+        <w:t>rm lab0/krabby9/</w:t>
+      </w:r>
+      <w:proofErr w:type="spellStart"/>
+      <w:r>
+        <w:rPr>
+          <w:rFonts w:cs="Times New Roman"/>
+          <w:color w:val="000000" w:themeColor="text1"/>
+          <w:kern w:val="0"/>
+          <w:szCs w:val="28"/>
+          <w:lang w:val="en-GB"/>
+        </w:rPr>
+        <w:t>eeveesni</w:t>
+      </w:r>
+      <w:proofErr w:type="spellEnd"/>
+      <w:r>
+        <w:rPr>
+          <w:rFonts w:cs="Times New Roman"/>
+          <w:color w:val="000000" w:themeColor="text1"/>
+          <w:kern w:val="0"/>
+          <w:szCs w:val="28"/>
+          <w:lang w:val="en-GB"/>
+        </w:rPr>
+        <w:t>*</w:t>
       </w:r>
     </w:p>
     <w:p>
@@ -10915,37 +10978,47 @@
           <w:lang w:val="en-GB"/>
         </w:rPr>
       </w:pPr>
-      <w:r>
-        <w:rPr>
-          <w:rFonts w:cs="Times New Roman"/>
-          <w:color w:val="000000" w:themeColor="text1"/>
-          <w:kern w:val="0"/>
-          <w:szCs w:val="28"/>
-          <w:lang w:val="en-GB"/>
-        </w:rPr>
-        <w:t>rm lab0/krabby9/</w:t>
-      </w:r>
-      <w:proofErr w:type="spellStart"/>
-      <w:r>
-        <w:rPr>
-          <w:rFonts w:cs="Times New Roman"/>
-          <w:color w:val="000000" w:themeColor="text1"/>
-          <w:kern w:val="0"/>
-          <w:szCs w:val="28"/>
-          <w:lang w:val="en-GB"/>
-        </w:rPr>
-        <w:t>eeveesni</w:t>
-      </w:r>
-      <w:proofErr w:type="spellEnd"/>
-      <w:r>
-        <w:rPr>
-          <w:rFonts w:cs="Times New Roman"/>
-          <w:color w:val="000000" w:themeColor="text1"/>
-          <w:kern w:val="0"/>
-          <w:szCs w:val="28"/>
-          <w:lang w:val="en-GB"/>
-        </w:rPr>
-        <w:t>*</w:t>
+      <w:proofErr w:type="spellStart"/>
+      <w:r>
+        <w:rPr>
+          <w:rFonts w:cs="Times New Roman"/>
+          <w:color w:val="000000" w:themeColor="text1"/>
+          <w:kern w:val="0"/>
+          <w:szCs w:val="28"/>
+          <w:lang w:val="en-GB"/>
+        </w:rPr>
+        <w:t>chmod</w:t>
+      </w:r>
+      <w:proofErr w:type="spellEnd"/>
+      <w:r>
+        <w:rPr>
+          <w:rFonts w:cs="Times New Roman"/>
+          <w:color w:val="000000" w:themeColor="text1"/>
+          <w:kern w:val="0"/>
+          <w:szCs w:val="28"/>
+          <w:lang w:val="en-GB"/>
+        </w:rPr>
+        <w:t xml:space="preserve"> </w:t>
+      </w:r>
+      <w:r>
+        <w:rPr>
+          <w:rFonts w:cs="Times New Roman"/>
+          <w:color w:val="000000" w:themeColor="text1"/>
+          <w:kern w:val="0"/>
+          <w:szCs w:val="28"/>
+          <w:lang w:val="en-GB"/>
+        </w:rPr>
+        <w:t>35</w:t>
+      </w:r>
+      <w:r>
+        <w:rPr>
+          <w:rFonts w:cs="Times New Roman"/>
+          <w:color w:val="000000" w:themeColor="text1"/>
+          <w:kern w:val="0"/>
+          <w:szCs w:val="28"/>
+          <w:lang w:val="en-GB"/>
+        </w:rPr>
+        <w:t>7 lab0/krabby9</w:t>
       </w:r>
     </w:p>
     <w:p>
@@ -10976,77 +11049,6 @@
           <w:lang w:val="en-GB"/>
         </w:rPr>
       </w:pPr>
-      <w:proofErr w:type="spellStart"/>
-      <w:r>
-        <w:rPr>
-          <w:rFonts w:cs="Times New Roman"/>
-          <w:color w:val="000000" w:themeColor="text1"/>
-          <w:kern w:val="0"/>
-          <w:szCs w:val="28"/>
-          <w:lang w:val="en-GB"/>
-        </w:rPr>
-        <w:t>chmod</w:t>
-      </w:r>
-      <w:proofErr w:type="spellEnd"/>
-      <w:r>
-        <w:rPr>
-          <w:rFonts w:cs="Times New Roman"/>
-          <w:color w:val="000000" w:themeColor="text1"/>
-          <w:kern w:val="0"/>
-          <w:szCs w:val="28"/>
-          <w:lang w:val="en-GB"/>
-        </w:rPr>
-        <w:t xml:space="preserve"> </w:t>
-      </w:r>
-      <w:r>
-        <w:rPr>
-          <w:rFonts w:cs="Times New Roman"/>
-          <w:color w:val="000000" w:themeColor="text1"/>
-          <w:kern w:val="0"/>
-          <w:szCs w:val="28"/>
-          <w:lang w:val="en-GB"/>
-        </w:rPr>
-        <w:t>35</w:t>
-      </w:r>
-      <w:r>
-        <w:rPr>
-          <w:rFonts w:cs="Times New Roman"/>
-          <w:color w:val="000000" w:themeColor="text1"/>
-          <w:kern w:val="0"/>
-          <w:szCs w:val="28"/>
-          <w:lang w:val="en-GB"/>
-        </w:rPr>
-        <w:t>7 lab0/krabby9</w:t>
-      </w:r>
-    </w:p>
-    <w:p>
-      <w:pPr>
-        <w:tabs>
-          <w:tab w:val="left" w:pos="560"/>
-          <w:tab w:val="left" w:pos="1120"/>
-          <w:tab w:val="left" w:pos="1680"/>
-          <w:tab w:val="left" w:pos="2240"/>
-          <w:tab w:val="left" w:pos="2800"/>
-          <w:tab w:val="left" w:pos="3360"/>
-          <w:tab w:val="left" w:pos="3920"/>
-          <w:tab w:val="left" w:pos="4480"/>
-          <w:tab w:val="left" w:pos="5040"/>
-          <w:tab w:val="left" w:pos="5600"/>
-          <w:tab w:val="left" w:pos="6160"/>
-          <w:tab w:val="left" w:pos="6720"/>
-        </w:tabs>
-        <w:autoSpaceDE w:val="0"/>
-        <w:autoSpaceDN w:val="0"/>
-        <w:adjustRightInd w:val="0"/>
-        <w:spacing w:after="0" w:line="240" w:lineRule="auto"/>
-        <w:rPr>
-          <w:rFonts w:cs="Times New Roman"/>
-          <w:color w:val="000000" w:themeColor="text1"/>
-          <w:kern w:val="0"/>
-          <w:szCs w:val="28"/>
-          <w:lang w:val="en-GB"/>
-        </w:rPr>
-      </w:pPr>
       <w:r>
         <w:rPr>
           <w:rFonts w:cs="Times New Roman"/>
@@ -11104,10 +11106,7 @@
     </w:p>
     <w:p>
       <w:r>
-        <w:t>Временно были</w:t>
-      </w:r>
-      <w:r>
-        <w:t xml:space="preserve"> изменены права доступа к </w:t>
+        <w:t xml:space="preserve">Временно были изменены права доступа к </w:t>
       </w:r>
       <w:r>
         <w:rPr>
@@ -11130,10 +11129,7 @@
         <w:t xml:space="preserve">9, </w:t>
       </w:r>
       <w:r>
-        <w:t xml:space="preserve">иначе </w:t>
-      </w:r>
-      <w:r>
-        <w:t>маска не сработала бы</w:t>
+        <w:t>иначе маска не сработала бы</w:t>
       </w:r>
       <w:r>
         <w:t>:</w:t>
@@ -11251,37 +11247,19 @@
         <w:jc w:val="center"/>
       </w:pPr>
     </w:p>
-    <w:p>
-      <w:pPr>
-        <w:rPr>
-          <w:lang w:val="en-US"/>
-        </w:rPr>
-      </w:pPr>
-    </w:p>
-    <w:p>
-      <w:pPr>
-        <w:rPr>
-          <w:lang w:val="en-US"/>
-        </w:rPr>
-      </w:pPr>
-    </w:p>
+    <w:p/>
+    <w:p/>
     <w:p>
       <w:pPr>
         <w:pStyle w:val="Heading2"/>
         <w:jc w:val="center"/>
-        <w:rPr>
-          <w:lang w:val="en-GB"/>
-        </w:rPr>
-      </w:pPr>
-      <w:bookmarkStart w:id="7" w:name="_Toc210432327"/>
+      </w:pPr>
+      <w:bookmarkStart w:id="7" w:name="_Toc210477882"/>
       <w:r>
         <w:lastRenderedPageBreak/>
         <w:t>Итоговый</w:t>
       </w:r>
       <w:r>
-        <w:rPr>
-          <w:lang w:val="en-GB"/>
-        </w:rPr>
         <w:t xml:space="preserve"> </w:t>
       </w:r>
       <w:r>
@@ -11289,13 +11267,7 @@
       </w:r>
       <w:bookmarkEnd w:id="7"/>
     </w:p>
-    <w:p>
-      <w:pPr>
-        <w:rPr>
-          <w:lang w:val="en-GB"/>
-        </w:rPr>
-      </w:pPr>
-    </w:p>
+    <w:p/>
     <w:p>
       <w:pPr>
         <w:ind w:firstLine="709"/>
@@ -11326,7 +11298,19 @@
           <w:rPr>
             <w:rStyle w:val="Hyperlink"/>
           </w:rPr>
-          <w:t>https://github.com/Miwm64/itmo_cse/tree/master/</w:t>
+          <w:t>https://github.com/Miwm64/itmo_cse/tr</w:t>
+        </w:r>
+        <w:r>
+          <w:rPr>
+            <w:rStyle w:val="Hyperlink"/>
+          </w:rPr>
+          <w:t>e</w:t>
+        </w:r>
+        <w:r>
+          <w:rPr>
+            <w:rStyle w:val="Hyperlink"/>
+          </w:rPr>
+          <w:t>e/master/</w:t>
         </w:r>
         <w:proofErr w:type="spellStart"/>
         <w:r>
@@ -11484,7 +11468,7 @@
           <w:bCs/>
         </w:rPr>
       </w:pPr>
-      <w:bookmarkStart w:id="8" w:name="_Toc210432328"/>
+      <w:bookmarkStart w:id="8" w:name="_Toc210477883"/>
       <w:r>
         <w:rPr>
           <w:b/>
@@ -11571,7 +11555,7 @@
           <w:bCs/>
         </w:rPr>
       </w:pPr>
-      <w:bookmarkStart w:id="9" w:name="_Toc210432329"/>
+      <w:bookmarkStart w:id="9" w:name="_Toc210477884"/>
       <w:r>
         <w:rPr>
           <w:b/>

</xml_diff>

<commit_message>
Changes 2 lab1 fopa
</commit_message>
<xml_diff>
--- a/fopa/lab1/report.docx
+++ b/fopa/lab1/report.docx
@@ -9225,7 +9225,27 @@
           <w:szCs w:val="28"/>
           <w:lang w:val="en-GB"/>
         </w:rPr>
-        <w:t>lR</w:t>
+        <w:t>l</w:t>
+      </w:r>
+      <w:r>
+        <w:rPr>
+          <w:rFonts w:cs="Times New Roman"/>
+          <w:color w:val="000000" w:themeColor="text1"/>
+          <w:kern w:val="0"/>
+          <w:szCs w:val="28"/>
+          <w:lang w:val="en-GB"/>
+        </w:rPr>
+        <w:t>p</w:t>
+      </w:r>
+      <w:r>
+        <w:rPr>
+          <w:rFonts w:cs="Times New Roman"/>
+          <w:color w:val="000000" w:themeColor="text1"/>
+          <w:kern w:val="0"/>
+          <w:szCs w:val="28"/>
+          <w:lang w:val="en-GB"/>
+        </w:rPr>
+        <w:t>R</w:t>
       </w:r>
       <w:proofErr w:type="spellEnd"/>
       <w:r>

</xml_diff>